<commit_message>
docs: add diagram placeholders to teaching proposal
</commit_message>
<xml_diff>
--- a/docs/customer-proposal/Intelligent_Experiment_Teaching_Platform_Proposal.docx
+++ b/docs/customer-proposal/Intelligent_Experiment_Teaching_Platform_Proposal.docx
@@ -2557,6 +2557,87 @@
         <w:spacing w:before="0" w:after="60" w:line="240" w:lineRule="auto"/>
       </w:pPr>
     </w:p>
+    <w:tbl>
+      <w:tblPr>
+        <w:tblStyle w:val="TableGrid"/>
+        <w:tblW w:type="auto" w:w="0"/>
+        <w:jc w:val="center"/>
+        <w:tblLayout w:type="fixed"/>
+        <w:tblLook w:firstColumn="1" w:firstRow="1" w:lastColumn="0" w:lastRow="0" w:noHBand="0" w:noVBand="1" w:val="04A0"/>
+      </w:tblPr>
+      <w:tblGrid>
+        <w:gridCol w:w="9128"/>
+      </w:tblGrid>
+      <w:tr>
+        <w:trPr>
+          <w:trHeight w:val="2409" w:hRule="exact"/>
+        </w:trPr>
+        <w:tc>
+          <w:tcPr>
+            <w:tcW w:type="dxa" w:w="9072"/>
+            <w:tcMar>
+              <w:top w:w="120" w:type="dxa"/>
+              <w:start w:w="160" w:type="dxa"/>
+              <w:bottom w:w="120" w:type="dxa"/>
+              <w:end w:w="160" w:type="dxa"/>
+            </w:tcMar>
+            <w:vAlign w:val="center"/>
+            <w:shd w:fill="F7F7F7" w:val="clear"/>
+            <w:tcBorders>
+              <w:top w:val="dashed" w:sz="10" w:color="A6A6A6"/>
+              <w:left w:val="dashed" w:sz="10" w:color="A6A6A6"/>
+              <w:bottom w:val="dashed" w:sz="10" w:color="A6A6A6"/>
+              <w:right w:val="dashed" w:sz="10" w:color="A6A6A6"/>
+            </w:tcBorders>
+          </w:tcPr>
+          <w:p>
+            <w:pPr>
+              <w:spacing w:before="0" w:after="100" w:line="276" w:lineRule="auto"/>
+              <w:jc w:val="center"/>
+            </w:pPr>
+            <w:r>
+              <w:rPr>
+                <w:rFonts w:ascii="Arial" w:hAnsi="Arial" w:eastAsia="黑体"/>
+                <w:b/>
+                <w:color w:val="7A7A7A"/>
+                <w:sz w:val="28"/>
+              </w:rPr>
+              <w:t>【图位：总体架构图】</w:t>
+            </w:r>
+          </w:p>
+          <w:p>
+            <w:pPr>
+              <w:spacing w:before="0" w:after="0" w:line="276" w:lineRule="auto"/>
+              <w:jc w:val="center"/>
+            </w:pPr>
+            <w:r>
+              <w:rPr>
+                <w:rFonts w:ascii="Arial" w:hAnsi="Arial" w:eastAsia="宋体"/>
+                <w:b w:val="0"/>
+                <w:color w:val="888888"/>
+                <w:sz w:val="19"/>
+              </w:rPr>
+              <w:t>建议内容：教学应用层—业务服务层—实验执行层—现场接入层—数据支撑层</w:t>
+            </w:r>
+          </w:p>
+        </w:tc>
+      </w:tr>
+    </w:tbl>
+    <w:p>
+      <w:pPr>
+        <w:spacing w:before="60" w:after="160" w:line="264" w:lineRule="auto"/>
+        <w:jc w:val="center"/>
+      </w:pPr>
+      <w:r>
+        <w:rPr>
+          <w:rFonts w:ascii="Arial" w:hAnsi="Arial" w:eastAsia="宋体"/>
+          <w:b w:val="0"/>
+          <w:color w:val="666666"/>
+          <w:sz w:val="19"/>
+        </w:rPr>
+        <w:t>图 1  总体架构图（图片待补充）</w:t>
+      </w:r>
+    </w:p>
     <w:p>
       <w:pPr>
         <w:keepNext/>
@@ -2615,6 +2696,87 @@
           <w:sz w:val="21"/>
         </w:rPr>
         <w:t>一次教学实验建立统一任务标识，关联课程、班级、小组、学生、实验室、工位、流程版本和设备配置。设备数据、操作日志、视频事件、AI 分析及评分记录均归入同一任务。实验启动后保存所用版本，确保后续修改模板时仍可还原原有实验。</w:t>
+      </w:r>
+    </w:p>
+    <w:tbl>
+      <w:tblPr>
+        <w:tblStyle w:val="TableGrid"/>
+        <w:tblW w:type="auto" w:w="0"/>
+        <w:jc w:val="center"/>
+        <w:tblLayout w:type="fixed"/>
+        <w:tblLook w:firstColumn="1" w:firstRow="1" w:lastColumn="0" w:lastRow="0" w:noHBand="0" w:noVBand="1" w:val="04A0"/>
+      </w:tblPr>
+      <w:tblGrid>
+        <w:gridCol w:w="9128"/>
+      </w:tblGrid>
+      <w:tr>
+        <w:trPr>
+          <w:trHeight w:val="2409" w:hRule="exact"/>
+        </w:trPr>
+        <w:tc>
+          <w:tcPr>
+            <w:tcW w:type="dxa" w:w="9072"/>
+            <w:tcMar>
+              <w:top w:w="120" w:type="dxa"/>
+              <w:start w:w="160" w:type="dxa"/>
+              <w:bottom w:w="120" w:type="dxa"/>
+              <w:end w:w="160" w:type="dxa"/>
+            </w:tcMar>
+            <w:vAlign w:val="center"/>
+            <w:shd w:fill="F7F7F7" w:val="clear"/>
+            <w:tcBorders>
+              <w:top w:val="dashed" w:sz="10" w:color="A6A6A6"/>
+              <w:left w:val="dashed" w:sz="10" w:color="A6A6A6"/>
+              <w:bottom w:val="dashed" w:sz="10" w:color="A6A6A6"/>
+              <w:right w:val="dashed" w:sz="10" w:color="A6A6A6"/>
+            </w:tcBorders>
+          </w:tcPr>
+          <w:p>
+            <w:pPr>
+              <w:spacing w:before="0" w:after="100" w:line="276" w:lineRule="auto"/>
+              <w:jc w:val="center"/>
+            </w:pPr>
+            <w:r>
+              <w:rPr>
+                <w:rFonts w:ascii="Arial" w:hAnsi="Arial" w:eastAsia="黑体"/>
+                <w:b/>
+                <w:color w:val="7A7A7A"/>
+                <w:sz w:val="28"/>
+              </w:rPr>
+              <w:t>【图位：数据中心业务闭环图】</w:t>
+            </w:r>
+          </w:p>
+          <w:p>
+            <w:pPr>
+              <w:spacing w:before="0" w:after="0" w:line="276" w:lineRule="auto"/>
+              <w:jc w:val="center"/>
+            </w:pPr>
+            <w:r>
+              <w:rPr>
+                <w:rFonts w:ascii="Arial" w:hAnsi="Arial" w:eastAsia="宋体"/>
+                <w:b w:val="0"/>
+                <w:color w:val="888888"/>
+                <w:sz w:val="19"/>
+              </w:rPr>
+              <w:t>建议内容：资源建设—任务发布—预约准入—实验执行—数据归档—分析评价—持续改进</w:t>
+            </w:r>
+          </w:p>
+        </w:tc>
+      </w:tr>
+    </w:tbl>
+    <w:p>
+      <w:pPr>
+        <w:spacing w:before="60" w:after="160" w:line="264" w:lineRule="auto"/>
+        <w:jc w:val="center"/>
+      </w:pPr>
+      <w:r>
+        <w:rPr>
+          <w:rFonts w:ascii="Arial" w:hAnsi="Arial" w:eastAsia="宋体"/>
+          <w:b w:val="0"/>
+          <w:color w:val="666666"/>
+          <w:sz w:val="19"/>
+        </w:rPr>
+        <w:t>图 2  数据中心业务闭环图（图片待补充）</w:t>
       </w:r>
     </w:p>
     <w:p>
@@ -8472,6 +8634,87 @@
           <w:sz w:val="21"/>
         </w:rPr>
         <w:t>教师可查看任务进度、所用资源、关键计算与最终建议。学生端按教学模式开放提示深度，考核任务按教师设置控制答案提示和辅助范围，兼顾学习支持与独立完成任务的要求。</w:t>
+      </w:r>
+    </w:p>
+    <w:tbl>
+      <w:tblPr>
+        <w:tblStyle w:val="TableGrid"/>
+        <w:tblW w:type="auto" w:w="0"/>
+        <w:jc w:val="center"/>
+        <w:tblLayout w:type="fixed"/>
+        <w:tblLook w:firstColumn="1" w:firstRow="1" w:lastColumn="0" w:lastRow="0" w:noHBand="0" w:noVBand="1" w:val="04A0"/>
+      </w:tblPr>
+      <w:tblGrid>
+        <w:gridCol w:w="9128"/>
+      </w:tblGrid>
+      <w:tr>
+        <w:trPr>
+          <w:trHeight w:val="2409" w:hRule="exact"/>
+        </w:trPr>
+        <w:tc>
+          <w:tcPr>
+            <w:tcW w:type="dxa" w:w="9072"/>
+            <w:tcMar>
+              <w:top w:w="120" w:type="dxa"/>
+              <w:start w:w="160" w:type="dxa"/>
+              <w:bottom w:w="120" w:type="dxa"/>
+              <w:end w:w="160" w:type="dxa"/>
+            </w:tcMar>
+            <w:vAlign w:val="center"/>
+            <w:shd w:fill="F7F7F7" w:val="clear"/>
+            <w:tcBorders>
+              <w:top w:val="dashed" w:sz="10" w:color="A6A6A6"/>
+              <w:left w:val="dashed" w:sz="10" w:color="A6A6A6"/>
+              <w:bottom w:val="dashed" w:sz="10" w:color="A6A6A6"/>
+              <w:right w:val="dashed" w:sz="10" w:color="A6A6A6"/>
+            </w:tcBorders>
+          </w:tcPr>
+          <w:p>
+            <w:pPr>
+              <w:spacing w:before="0" w:after="100" w:line="276" w:lineRule="auto"/>
+              <w:jc w:val="center"/>
+            </w:pPr>
+            <w:r>
+              <w:rPr>
+                <w:rFonts w:ascii="Arial" w:hAnsi="Arial" w:eastAsia="黑体"/>
+                <w:b/>
+                <w:color w:val="7A7A7A"/>
+                <w:sz w:val="28"/>
+              </w:rPr>
+              <w:t>【图位：多 Agent 协作图】</w:t>
+            </w:r>
+          </w:p>
+          <w:p>
+            <w:pPr>
+              <w:spacing w:before="0" w:after="0" w:line="276" w:lineRule="auto"/>
+              <w:jc w:val="center"/>
+            </w:pPr>
+            <w:r>
+              <w:rPr>
+                <w:rFonts w:ascii="Arial" w:hAnsi="Arial" w:eastAsia="宋体"/>
+                <w:b w:val="0"/>
+                <w:color w:val="888888"/>
+                <w:sz w:val="19"/>
+              </w:rPr>
+              <w:t>建议内容：教学设计—流程规划—仿真计算—实验指导—数据分析—报告评价</w:t>
+            </w:r>
+          </w:p>
+        </w:tc>
+      </w:tr>
+    </w:tbl>
+    <w:p>
+      <w:pPr>
+        <w:spacing w:before="60" w:after="160" w:line="264" w:lineRule="auto"/>
+        <w:jc w:val="center"/>
+      </w:pPr>
+      <w:r>
+        <w:rPr>
+          <w:rFonts w:ascii="Arial" w:hAnsi="Arial" w:eastAsia="宋体"/>
+          <w:b w:val="0"/>
+          <w:color w:val="666666"/>
+          <w:sz w:val="19"/>
+        </w:rPr>
+        <w:t>图 3  多 Agent 协作图（图片待补充）</w:t>
       </w:r>
     </w:p>
     <w:p>
@@ -14051,6 +14294,87 @@
       <w:pPr>
         <w:spacing w:before="0" w:after="60" w:line="240" w:lineRule="auto"/>
       </w:pPr>
+    </w:p>
+    <w:tbl>
+      <w:tblPr>
+        <w:tblStyle w:val="TableGrid"/>
+        <w:tblW w:type="auto" w:w="0"/>
+        <w:jc w:val="center"/>
+        <w:tblLayout w:type="fixed"/>
+        <w:tblLook w:firstColumn="1" w:firstRow="1" w:lastColumn="0" w:lastRow="0" w:noHBand="0" w:noVBand="1" w:val="04A0"/>
+      </w:tblPr>
+      <w:tblGrid>
+        <w:gridCol w:w="9128"/>
+      </w:tblGrid>
+      <w:tr>
+        <w:trPr>
+          <w:trHeight w:val="2409" w:hRule="exact"/>
+        </w:trPr>
+        <w:tc>
+          <w:tcPr>
+            <w:tcW w:type="dxa" w:w="9072"/>
+            <w:tcMar>
+              <w:top w:w="120" w:type="dxa"/>
+              <w:start w:w="160" w:type="dxa"/>
+              <w:bottom w:w="120" w:type="dxa"/>
+              <w:end w:w="160" w:type="dxa"/>
+            </w:tcMar>
+            <w:vAlign w:val="center"/>
+            <w:shd w:fill="F7F7F7" w:val="clear"/>
+            <w:tcBorders>
+              <w:top w:val="dashed" w:sz="10" w:color="A6A6A6"/>
+              <w:left w:val="dashed" w:sz="10" w:color="A6A6A6"/>
+              <w:bottom w:val="dashed" w:sz="10" w:color="A6A6A6"/>
+              <w:right w:val="dashed" w:sz="10" w:color="A6A6A6"/>
+            </w:tcBorders>
+          </w:tcPr>
+          <w:p>
+            <w:pPr>
+              <w:spacing w:before="0" w:after="100" w:line="276" w:lineRule="auto"/>
+              <w:jc w:val="center"/>
+            </w:pPr>
+            <w:r>
+              <w:rPr>
+                <w:rFonts w:ascii="Arial" w:hAnsi="Arial" w:eastAsia="黑体"/>
+                <w:b/>
+                <w:color w:val="7A7A7A"/>
+                <w:sz w:val="28"/>
+              </w:rPr>
+              <w:t>【图位：教学闭环图】</w:t>
+            </w:r>
+          </w:p>
+          <w:p>
+            <w:pPr>
+              <w:spacing w:before="0" w:after="0" w:line="276" w:lineRule="auto"/>
+              <w:jc w:val="center"/>
+            </w:pPr>
+            <w:r>
+              <w:rPr>
+                <w:rFonts w:ascii="Arial" w:hAnsi="Arial" w:eastAsia="宋体"/>
+                <w:b w:val="0"/>
+                <w:color w:val="888888"/>
+                <w:sz w:val="19"/>
+              </w:rPr>
+              <w:t>建议内容：课前学习—仿真训练—现场实验—实时指导—报告评价—教学分析</w:t>
+            </w:r>
+          </w:p>
+        </w:tc>
+      </w:tr>
+    </w:tbl>
+    <w:p>
+      <w:pPr>
+        <w:spacing w:before="60" w:after="160" w:line="264" w:lineRule="auto"/>
+        <w:jc w:val="center"/>
+      </w:pPr>
+      <w:r>
+        <w:rPr>
+          <w:rFonts w:ascii="Arial" w:hAnsi="Arial" w:eastAsia="宋体"/>
+          <w:b w:val="0"/>
+          <w:color w:val="666666"/>
+          <w:sz w:val="19"/>
+        </w:rPr>
+        <w:t>图 4  教学闭环图（图片待补充）</w:t>
+      </w:r>
     </w:p>
     <w:p>
       <w:pPr>

</xml_diff>